<commit_message>
feat(corpus): make operator manuals cover every variant of their machine
A manual covered one randomly chosen configuration, which meant a question
about a specific item number could only be answered if that variant happened
to be the one the manual was written about.

Manuals now carry a configuration table with a row per variant, and their front
matter lists every item number of the machine. The figures genuinely differ
between them -- the AGM and lithium variants take different charging regimes,
the pad-deck variant carries a smaller tank -- so a question about one item
number has to find the right row rather than the right document. That is the
harder and more realistic retrieval problem, and the reason the catalogue has
two or three variants per machine at all.
</commit_message>
<xml_diff>
--- a/data/corpus/published/sdr-90-operator-manual-hu.docx
+++ b/data/corpus/published/sdr-90-operator-manual-hu.docx
@@ -31,7 +31,7 @@
         <w:rPr>
           <w:sz w:val="16"/>
         </w:rPr>
-        <w:t>Item numbers: 1.534-211.0</w:t>
+        <w:t>Item numbers: 1.534-210.0, 1.534-211.0, 1.534-212.0</w:t>
       </w:r>
     </w:p>
     <w:p>
@@ -47,6 +47,195 @@
         <w:t>Ez a kézikönyv a SDR-90 vezetőüléses súroló-szárítógép típusra vonatkozik, 1.534-211.0 cikkszámmal. A gép ipari, beltéri használatra készült bevonatos padlókon. Minden más használat a jóváhagyáson kívül esik.</w:t>
       </w:r>
     </w:p>
+    <w:p>
+      <w:pPr>
+        <w:pStyle w:val="Heading2"/>
+      </w:pPr>
+      <w:r>
+        <w:t>Érintett kivitelek</w:t>
+      </w:r>
+    </w:p>
+    <w:tbl>
+      <w:tblPr>
+        <w:tblStyle w:val="TableGrid"/>
+        <w:tblW w:type="auto" w:w="0"/>
+        <w:tblLook w:firstColumn="1" w:firstRow="1" w:lastColumn="0" w:lastRow="0" w:noHBand="0" w:noVBand="1" w:val="04A0"/>
+      </w:tblPr>
+      <w:tblGrid>
+        <w:gridCol w:w="2160"/>
+        <w:gridCol w:w="2160"/>
+        <w:gridCol w:w="2160"/>
+        <w:gridCol w:w="2160"/>
+      </w:tblGrid>
+      <w:tr>
+        <w:tc>
+          <w:tcPr>
+            <w:tcW w:type="dxa" w:w="2160"/>
+          </w:tcPr>
+          <w:p>
+            <w:r>
+              <w:t>Cikkszám</w:t>
+            </w:r>
+          </w:p>
+        </w:tc>
+        <w:tc>
+          <w:tcPr>
+            <w:tcW w:type="dxa" w:w="2160"/>
+          </w:tcPr>
+          <w:p>
+            <w:r>
+              <w:t>Akkumulátor</w:t>
+            </w:r>
+          </w:p>
+        </w:tc>
+        <w:tc>
+          <w:tcPr>
+            <w:tcW w:type="dxa" w:w="2160"/>
+          </w:tcPr>
+          <w:p>
+            <w:r>
+              <w:t>Tárcsa</w:t>
+            </w:r>
+          </w:p>
+        </w:tc>
+        <w:tc>
+          <w:tcPr>
+            <w:tcW w:type="dxa" w:w="2160"/>
+          </w:tcPr>
+          <w:p>
+            <w:r>
+              <w:t>Kapacitás</w:t>
+            </w:r>
+          </w:p>
+        </w:tc>
+      </w:tr>
+      <w:tr>
+        <w:tc>
+          <w:tcPr>
+            <w:tcW w:type="dxa" w:w="2160"/>
+          </w:tcPr>
+          <w:p>
+            <w:r>
+              <w:t>1.534-210.0</w:t>
+            </w:r>
+          </w:p>
+        </w:tc>
+        <w:tc>
+          <w:tcPr>
+            <w:tcW w:type="dxa" w:w="2160"/>
+          </w:tcPr>
+          <w:p>
+            <w:r>
+              <w:t>AGM</w:t>
+            </w:r>
+          </w:p>
+        </w:tc>
+        <w:tc>
+          <w:tcPr>
+            <w:tcW w:type="dxa" w:w="2160"/>
+          </w:tcPr>
+          <w:p>
+            <w:r>
+              <w:t>brush</w:t>
+            </w:r>
+          </w:p>
+        </w:tc>
+        <w:tc>
+          <w:tcPr>
+            <w:tcW w:type="dxa" w:w="2160"/>
+          </w:tcPr>
+          <w:p>
+            <w:r>
+              <w:t>110 l oldat / 120 l szennyvíz</w:t>
+            </w:r>
+          </w:p>
+        </w:tc>
+      </w:tr>
+      <w:tr>
+        <w:tc>
+          <w:tcPr>
+            <w:tcW w:type="dxa" w:w="2160"/>
+          </w:tcPr>
+          <w:p>
+            <w:r>
+              <w:t>1.534-211.0</w:t>
+            </w:r>
+          </w:p>
+        </w:tc>
+        <w:tc>
+          <w:tcPr>
+            <w:tcW w:type="dxa" w:w="2160"/>
+          </w:tcPr>
+          <w:p>
+            <w:r>
+              <w:t>lithium-ion</w:t>
+            </w:r>
+          </w:p>
+        </w:tc>
+        <w:tc>
+          <w:tcPr>
+            <w:tcW w:type="dxa" w:w="2160"/>
+          </w:tcPr>
+          <w:p>
+            <w:r>
+              <w:t>brush</w:t>
+            </w:r>
+          </w:p>
+        </w:tc>
+        <w:tc>
+          <w:tcPr>
+            <w:tcW w:type="dxa" w:w="2160"/>
+          </w:tcPr>
+          <w:p>
+            <w:r>
+              <w:t>110 l oldat / 120 l szennyvíz</w:t>
+            </w:r>
+          </w:p>
+        </w:tc>
+      </w:tr>
+      <w:tr>
+        <w:tc>
+          <w:tcPr>
+            <w:tcW w:type="dxa" w:w="2160"/>
+          </w:tcPr>
+          <w:p>
+            <w:r>
+              <w:t>1.534-212.0</w:t>
+            </w:r>
+          </w:p>
+        </w:tc>
+        <w:tc>
+          <w:tcPr>
+            <w:tcW w:type="dxa" w:w="2160"/>
+          </w:tcPr>
+          <w:p>
+            <w:r>
+              <w:t>lithium-ion</w:t>
+            </w:r>
+          </w:p>
+        </w:tc>
+        <w:tc>
+          <w:tcPr>
+            <w:tcW w:type="dxa" w:w="2160"/>
+          </w:tcPr>
+          <w:p>
+            <w:r>
+              <w:t>pad</w:t>
+            </w:r>
+          </w:p>
+        </w:tc>
+        <w:tc>
+          <w:tcPr>
+            <w:tcW w:type="dxa" w:w="2160"/>
+          </w:tcPr>
+          <w:p>
+            <w:r>
+              <w:t>150 l oldat / 160 l szennyvíz</w:t>
+            </w:r>
+          </w:p>
+        </w:tc>
+      </w:tr>
+    </w:tbl>
     <w:p>
       <w:pPr>
         <w:pStyle w:val="Heading2"/>

</xml_diff>